<commit_message>
Harden task: strip costing memo to principles, add re-created/rebuilt id traps, retune labour so the decision is contestable
Co-Authored-By: Claude Sonnet 5.5 <noreply@anthropic.com>
Claude-Session: https://claude.ai/code/session_015zvfotZNd3VuWwxgMsj6vJ
</commit_message>
<xml_diff>
--- a/project_mark_task/inputs/costing_policy_v3.docx
+++ b/project_mark_task/inputs/costing_policy_v3.docx
@@ -20,63 +20,12 @@
         <w:pStyle w:val="Heading2"/>
       </w:pPr>
       <w:r>
-        <w:t>1. What counts as one business run</w:t>
+        <w:t>1. Unit of measure: the business run</w:t>
       </w:r>
     </w:p>
     <w:p>
-      <w:pPr>
-        <w:pStyle w:val="ListBullet"/>
-      </w:pPr>
       <w:r>
-        <w:t>A business run is one first-attempt, successful, production execution of a workflow for one trigger event.</w:t>
-      </w:r>
-    </w:p>
-    <w:p>
-      <w:pPr>
-        <w:pStyle w:val="ListBullet"/>
-      </w:pPr>
-      <w:r>
-        <w:t>Not counted: failed executions, retry attempts and replays of earlier failures, manual or editor test runs, and runs from sandbox or scratch workflows (no workflow_id in the crosswalk).</w:t>
-      </w:r>
-    </w:p>
-    <w:p>
-      <w:pPr>
-        <w:pStyle w:val="ListBullet"/>
-      </w:pPr>
-      <w:r>
-        <w:t>Internal Northgate workflows (client_id INTERNAL) are real consumption and are counted.</w:t>
-      </w:r>
-    </w:p>
-    <w:p>
-      <w:pPr>
-        <w:pStyle w:val="ListBullet"/>
-      </w:pPr>
-      <w:r>
-        <w:t>Where an export lists the same day for the same workflow more than once because of overlapping export batches, the batch with the latest exported_at is the one to use (earlier batches are missing late-arriving runs).</w:t>
-      </w:r>
-    </w:p>
-    <w:p>
-      <w:pPr>
-        <w:pStyle w:val="ListBullet"/>
-      </w:pPr>
-      <w:r>
-        <w:t>During a parallel run (see the change log), the old build is the system of record. Count the old platform's runs from the 'parallel run started' date up to the day before cutover; the new platform's runs in that window are mirrors and are not counted. From the cutover date on, count the new platform only.</w:t>
-      </w:r>
-    </w:p>
-    <w:p>
-      <w:pPr>
-        <w:pStyle w:val="ListBullet"/>
-      </w:pPr>
-      <w:r>
-        <w:t>Incident days: where the incident log gives a duplicate_delivery_rate, the reported successful runs on affected workflows and days include duplicate deliveries. Business runs = reported / (1 + rate), rounded to the nearest whole run per workflow per day. For n8n, duplicates are removed by eventId (one run per workflow and eventId).</w:t>
-      </w:r>
-    </w:p>
-    <w:p>
-      <w:pPr>
-        <w:pStyle w:val="ListBullet"/>
-      </w:pPr>
-      <w:r>
-        <w:t>Days are UTC calendar days. Make and Zapier daily exports already carry calendar dates and are used as given; n8n timestamps carry a local UTC offset and must be converted to UTC before taking the date.</w:t>
+        <w:t>Platform invoices are not comparable because each vendor counts something different (operations, tasks, executions). Compare platforms on business runs. A business run is one first-attempt, successful, production execution of a workflow for one trigger event. Failures, retries, replays, manual or test runs and scratch workflows are not business runs. Internal Northgate workflows are real consumption and count. Every event is counted once, however many systems or exports happened to record it.</w:t>
       </w:r>
     </w:p>
     <w:p>
@@ -84,23 +33,12 @@
         <w:pStyle w:val="Heading2"/>
       </w:pPr>
       <w:r>
-        <w:t>2. Converting runs into billable units on a target platform</w:t>
+        <w:t>2. Billable units on a target platform</w:t>
       </w:r>
     </w:p>
     <w:p>
-      <w:pPr>
-        <w:pStyle w:val="ListBullet"/>
-      </w:pPr>
       <w:r>
-        <w:t>Make bills operations: runs x make_modules_per_run. Zapier bills tasks: runs x zapier_billable_steps. n8n bills executions: 1 per run.</w:t>
-      </w:r>
-    </w:p>
-    <w:p>
-      <w:pPr>
-        <w:pStyle w:val="ListBullet"/>
-      </w:pPr>
-      <w:r>
-        <w:t>The per-run unit counts come from the workflow catalog 'versions' sheet. Use the latest version with status 'deployed' and an effective_from on or before 30 Sep 2025. Draft versions are ignored.</w:t>
+        <w:t>Make bills operations (modules executed per run), Zapier bills tasks (billable steps per run), n8n bills executions (one per run). Per-run counts for the build that is currently deployed are in the workflow catalog.</w:t>
       </w:r>
     </w:p>
     <w:p>
@@ -116,7 +54,7 @@
         <w:pStyle w:val="ListBullet"/>
       </w:pPr>
       <w:r>
-        <w:t>The forward year is Nov 2025 - Oct 2026. Each forward month repeats the volume of the same calendar month in the trailing window Oct 2024 - Sep 2025 (Nov 2025 uses Nov 2024, ..., Oct 2026 uses Oct 2024).</w:t>
+        <w:t>The forward year is Nov 2025 - Oct 2026 and repeats, month for month, the trailing window Oct 2024 - Sep 2025, for clients we still have.</w:t>
       </w:r>
     </w:p>
     <w:p>
@@ -124,7 +62,7 @@
         <w:pStyle w:val="ListBullet"/>
       </w:pPr>
       <w:r>
-        <w:t>Clients that have churned (status churned/inactive, or an end date on or before 30 Sep 2025) drop out of the forward volume and out of any migration effort. Internal workflows stay in.</w:t>
+        <w:t>Subscription: one plan per platform for the year, chosen to minimise plan fees plus overage under the contract terms.</w:t>
       </w:r>
     </w:p>
     <w:p>
@@ -132,23 +70,7 @@
         <w:pStyle w:val="ListBullet"/>
       </w:pPr>
       <w:r>
-        <w:t>Subscription: choose the single plan per platform that gives the lowest 12-month cost (plan fees plus overage, with the contract adjustments). For n8n the plan must also cover the busiest forward month.</w:t>
-      </w:r>
-    </w:p>
-    <w:p>
-      <w:pPr>
-        <w:pStyle w:val="ListBullet"/>
-      </w:pPr>
-      <w:r>
-        <w:t>Convert USD to EUR with the latest published EURUSD rate for 2025-09 in fx_rates.csv (EUR = USD / rate). Ignore the USDEUR rows.</w:t>
-      </w:r>
-    </w:p>
-    <w:p>
-      <w:pPr>
-        <w:pStyle w:val="ListBullet"/>
-      </w:pPr>
-      <w:r>
-        <w:t>Do not round monthly figures except where the contract says overage is billed in rounded-up blocks.</w:t>
+        <w:t>Northgate budgets in EUR. Use the most recent published rate for the latest month in fx_rates.csv.</w:t>
       </w:r>
     </w:p>
     <w:p>
@@ -161,7 +83,7 @@
     </w:p>
     <w:p>
       <w:r>
-        <w:t>To standardise on a platform, every in-scope workflow that is not already running on it must be rebuilt. A workflow's current platform is where it runs after any cutover in the change log (the catalog's platform column is a snapshot and can be out of date). Labour is costed at EUR 36 per hour.</w:t>
+        <w:t>To standardise on a platform, every in-scope workflow that is not already running on it must be rebuilt. Labour is costed at EUR 30 per hour.</w:t>
       </w:r>
     </w:p>
     <w:tbl>
@@ -306,7 +228,7 @@
     </w:tbl>
     <w:p>
       <w:r>
-        <w:t>Nodes come from the catalog 'workflows' sheet. If a workflow needs a connector that the target platform does not support (connector_support.csv), add 8 hours of custom build per unsupported connector.</w:t>
+        <w:t>Nodes come from the workflow catalog. If a workflow needs a connector that the target platform does not support (connector_support.csv), add 4 hours of custom build per unsupported connector.</w:t>
       </w:r>
     </w:p>
     <w:p>
@@ -319,7 +241,7 @@
     </w:p>
     <w:p>
       <w:r>
-        <w:t>Compare platforms on total 12-month cost in EUR = subscription (fees + overage) + one-off migration labour. Recommend the lowest. Show the components.</w:t>
+        <w:t>Compare platforms on total 12-month cost in EUR = subscription (fees + overage) + one-off migration labour. Recommend the lowest and show the components.</w:t>
       </w:r>
     </w:p>
     <w:sectPr>

</xml_diff>

<commit_message>
v3: add helper sub-flow workflows (catalog notes only), retune pricing/hours, update reference outputs and rubric
Co-Authored-By: Claude Sonnet 5.5 <noreply@anthropic.com>
Claude-Session: https://claude.ai/code/session_015zvfotZNd3VuWwxgMsj6vJ
</commit_message>
<xml_diff>
--- a/project_mark_task/inputs/costing_policy_v3.docx
+++ b/project_mark_task/inputs/costing_policy_v3.docx
@@ -25,7 +25,7 @@
     </w:p>
     <w:p>
       <w:r>
-        <w:t>Platform invoices are not comparable because each vendor counts something different (operations, tasks, executions). Compare platforms on business runs. A business run is one first-attempt, successful, production execution of a workflow for one trigger event. Failures, retries, replays, manual or test runs and scratch workflows are not business runs. Internal Northgate workflows are real consumption and count. Every event is counted once, however many systems or exports happened to record it.</w:t>
+        <w:t>Platform invoices are not comparable because each vendor counts something different (operations, tasks, executions). Compare platforms on business runs. A business run is one first-attempt, successful, production execution of a workflow for one trigger event. Failures, retries, replays, manual or test runs and scratch workflows are not business runs. Internal Northgate workflows are real consumption and count. Every event is counted once, however many systems or exports happened to record it. A trigger event that fans out into helper workflows is still one business event.</w:t>
       </w:r>
     </w:p>
     <w:p>
@@ -38,7 +38,7 @@
     </w:p>
     <w:p>
       <w:r>
-        <w:t>Make bills operations (modules executed per run), Zapier bills tasks (billable steps per run), n8n bills executions (one per run). Per-run counts for the build that is currently deployed are in the workflow catalog.</w:t>
+        <w:t>Make bills operations (modules executed per run), Zapier bills tasks (billable steps per run), n8n bills executions (one per execution). Per-run counts for the build that is currently deployed are in the workflow catalog. A helper's consumption is still billed on any platform, so it belongs to the cost of its parent's business runs.</w:t>
       </w:r>
     </w:p>
     <w:p>
@@ -210,7 +210,7 @@
           </w:tcPr>
           <w:p>
             <w:r>
-              <w:t>3.0</w:t>
+              <w:t>2.0</w:t>
             </w:r>
           </w:p>
         </w:tc>
@@ -220,7 +220,7 @@
           </w:tcPr>
           <w:p>
             <w:r>
-              <w:t>0.55</w:t>
+              <w:t>0.40</w:t>
             </w:r>
           </w:p>
         </w:tc>

</xml_diff>

<commit_message>
v4 task: Zapier upgrade clause, one-off backfills, retuned costs, final prompt, rubric v4, upload zip
Co-Authored-By: Claude Sonnet 5.5 <noreply@anthropic.com>
Claude-Session: https://claude.ai/code/session_015zvfotZNd3VuWwxgMsj6vJ
</commit_message>
<xml_diff>
--- a/project_mark_task/inputs/costing_policy_v3.docx
+++ b/project_mark_task/inputs/costing_policy_v3.docx
@@ -146,7 +146,7 @@
           </w:tcPr>
           <w:p>
             <w:r>
-              <w:t>0.6</w:t>
+              <w:t>1.4</w:t>
             </w:r>
           </w:p>
         </w:tc>
@@ -156,7 +156,7 @@
           </w:tcPr>
           <w:p>
             <w:r>
-              <w:t>0.12</w:t>
+              <w:t>0.28</w:t>
             </w:r>
           </w:p>
         </w:tc>
@@ -228,7 +228,7 @@
     </w:tbl>
     <w:p>
       <w:r>
-        <w:t>Nodes come from the workflow catalog. If a workflow needs a connector that the target platform does not support (connector_support.csv), add 4 hours of custom build per unsupported connector.</w:t>
+        <w:t>Nodes come from the workflow catalog. If a workflow needs a connector that the target platform does not support (connector_support.csv), add 8 hours of custom build per unsupported connector.</w:t>
       </w:r>
     </w:p>
     <w:p>

</xml_diff>

<commit_message>
v5: Zapier export column drift, re-signed clients, more incidents, Make negotiated rate; retuned costs, rubric v5, scorer
Co-Authored-By: Claude Sonnet 5.5 <noreply@anthropic.com>
Claude-Session: https://claude.ai/code/session_015zvfotZNd3VuWwxgMsj6vJ
</commit_message>
<xml_diff>
--- a/project_mark_task/inputs/costing_policy_v3.docx
+++ b/project_mark_task/inputs/costing_policy_v3.docx
@@ -146,7 +146,7 @@
           </w:tcPr>
           <w:p>
             <w:r>
-              <w:t>1.4</w:t>
+              <w:t>0.6</w:t>
             </w:r>
           </w:p>
         </w:tc>
@@ -156,7 +156,7 @@
           </w:tcPr>
           <w:p>
             <w:r>
-              <w:t>0.28</w:t>
+              <w:t>0.12</w:t>
             </w:r>
           </w:p>
         </w:tc>

</xml_diff>